<commit_message>
policy updated, task1 pdf merge into a one file
</commit_message>
<xml_diff>
--- a/2026-T2/B2-BSBXCS402-Promote-workplace-cyber-sec-awar/submitted-task2/BSBXCS402-Task2.docx
+++ b/2026-T2/B2-BSBXCS402-Promote-workplace-cyber-sec-awar/submitted-task2/BSBXCS402-Task2.docx
@@ -1504,18 +1504,31 @@
     <w:p/>
     <w:p/>
     <w:p>
+      <w:pPr>
+        <w:pStyle w:val="Heading2"/>
+      </w:pPr>
       <w:r>
         <w:br w:type="page"/>
       </w:r>
       <w:r>
         <w:lastRenderedPageBreak/>
-        <w:t>Key findings</w:t>
-      </w:r>
-      <w:r>
-        <w:t xml:space="preserve"> and</w:t>
-      </w:r>
-      <w:r>
-        <w:t xml:space="preserve"> trends regarding cyber security awareness and practices</w:t>
+        <w:t xml:space="preserve">Key Findings </w:t>
+      </w:r>
+      <w:proofErr w:type="gramStart"/>
+      <w:r>
+        <w:t>And</w:t>
+      </w:r>
+      <w:proofErr w:type="gramEnd"/>
+      <w:r>
+        <w:t xml:space="preserve"> Trends Regarding Cyber Security Awareness </w:t>
+      </w:r>
+      <w:proofErr w:type="gramStart"/>
+      <w:r>
+        <w:t>And</w:t>
+      </w:r>
+      <w:proofErr w:type="gramEnd"/>
+      <w:r>
+        <w:t xml:space="preserve"> Practices</w:t>
       </w:r>
     </w:p>
     <w:p/>
@@ -1601,11 +1614,11 @@
     </w:p>
     <w:p>
       <w:r>
-        <w:t xml:space="preserve">A clear and concerning trend emerged in this section. Three of the six participants would report a suspected incident to their direct manager rather than the IT or security team, and one participant would attempt to investigate or resolve the issue independently. This behaviour can delay the containment of a threat and, in serious cases, destroy forensic evidence. While four participants indicated they know how to report an incident, two </w:t>
+        <w:t xml:space="preserve">A clear and concerning trend emerged in this section. Three of the six participants would report a suspected incident to their direct manager rather than the IT or security team, and one participant would attempt to investigate or resolve the issue independently. This behaviour can delay the containment of a threat and, in serious cases, destroy forensic </w:t>
       </w:r>
       <w:r>
         <w:lastRenderedPageBreak/>
-        <w:t>remained neutral, suggesting that the reporting channel exists but has not been communicated consistently or tested in practice.</w:t>
+        <w:t>evidence. While four participants indicated they know how to report an incident, two remained neutral, suggesting that the reporting channel exists but has not been communicated consistently or tested in practice.</w:t>
       </w:r>
     </w:p>
     <w:p>

</xml_diff>